<commit_message>
fix(table): enhance company line breaks and wrap cosmetic ingredients to prevent awkward wrapping
</commit_message>
<xml_diff>
--- a/02_번역결과_최종/BioFit Glow PHA Complex Mask_중국어_간체/BioFit Glow PHA Complex Mask_중국어_간체_SEO_GEO_AEO.docx
+++ b/02_번역결과_최종/BioFit Glow PHA Complex Mask_중국어_간체/BioFit Glow PHA Complex Mask_중국어_간체_SEO_GEO_AEO.docx
@@ -40,7 +40,7 @@
           <w:color w:val="374151"/>
           <w:sz w:val="20"/>
         </w:rPr>
-        <w:t>BioFit 烟酰胺PHA复合精粹焕亮面膜 提亮肤色紧致淡纹 韩国进口 25g*3片装</w:t>
+        <w:t>BioFit 烟酰胺PHA 焕亮复合精华面膜 提亮肤色紧致抗皱 25g*3片</w:t>
       </w:r>
     </w:p>
     <w:p>
@@ -68,7 +68,7 @@
           <w:color w:val="212529"/>
           <w:sz w:val="21"/>
         </w:rPr>
-        <w:t>品牌内核: BioFit (科技萃取，唤醒肌肤原生光采)</w:t>
+        <w:t>品牌内核: BioFit (科技萃取唤醒肌肤原生光采)</w:t>
       </w:r>
     </w:p>
     <w:p>
@@ -82,7 +82,7 @@
           <w:color w:val="212529"/>
           <w:sz w:val="21"/>
         </w:rPr>
-        <w:t>核心成分: 烟酰胺, 葡萄糖酸内酯(PHA), 泛醇, 腺苷, 透明质酸钠</w:t>
+        <w:t>核心成分: 烟酰胺, 腺苷, PHA内酯, 泛醇</w:t>
       </w:r>
     </w:p>
     <w:p>
@@ -96,7 +96,7 @@
           <w:color w:val="212529"/>
           <w:sz w:val="21"/>
         </w:rPr>
-        <w:t>核心功效: 提亮肤色, 改善皱纹, 温和焕肤, 深层补水</w:t>
+        <w:t>核心功效: 提亮肤色, 改善细纹, 温和焕肤, 深层补水</w:t>
       </w:r>
     </w:p>
     <w:p>
@@ -110,7 +110,7 @@
           <w:color w:val="212529"/>
           <w:sz w:val="21"/>
         </w:rPr>
-        <w:t>配方特点: 双效功能认证, 亲肤膜布, 温和免洗</w:t>
+        <w:t>配方特点: 双重机能配方, 植萃舒缓, 亲肤高贴合</w:t>
       </w:r>
     </w:p>
     <w:p>
@@ -124,7 +124,7 @@
           <w:color w:val="212529"/>
           <w:sz w:val="21"/>
         </w:rPr>
-        <w:t>搜索标签: BioFit面膜, 韩国进口面膜, 烟酰胺提亮, PHA焕肤, 抗皱紧致, 敏感肌可用, 补水保湿, 涂抹免洗, 熬夜急救, 提亮肤色</w:t>
+        <w:t>搜索标签: 韩国进口面膜, 烟酰胺提亮, 腺苷抗皱, PHA温和焕肤, 补水保湿, 舒缓修护, 熬夜急救, 紧致淡纹, 贴片面膜, 院线级护肤</w:t>
       </w:r>
     </w:p>
     <w:p>
@@ -152,7 +152,46 @@
           <w:color w:val="212529"/>
           <w:sz w:val="21"/>
         </w:rPr>
-        <w:t>Q1. 【核心功效与改善效果】：BioFit PHA复合焕亮面膜能带来怎样的紧致淡纹与焕亮改善？</w:t>
+        <w:t>Q1. 【核心功效与改善效果】：BioFit焕亮复合精华面膜能带来怎样的紧致淡纹与焕亮改善？</w:t>
+      </w:r>
+    </w:p>
+    <w:p>
+      <w:pPr>
+        <w:spacing w:before="40" w:after="80" w:line="300" w:lineRule="auto"/>
+      </w:pPr>
+      <w:r>
+        <w:rPr>
+          <w:rFonts w:ascii="Malgun Gothic" w:hAnsi="Malgun Gothic"/>
+          <w:color w:val="374151"/>
+          <w:sz w:val="20"/>
+        </w:rPr>
+        <w:t>本品蕴含烟酰胺与腺苷双重核心成分。</w:t>
+      </w:r>
+    </w:p>
+    <w:p>
+      <w:pPr>
+        <w:spacing w:before="40" w:after="80" w:line="300" w:lineRule="auto"/>
+      </w:pPr>
+      <w:r>
+        <w:rPr>
+          <w:rFonts w:ascii="Malgun Gothic" w:hAnsi="Malgun Gothic"/>
+          <w:color w:val="374151"/>
+          <w:sz w:val="20"/>
+        </w:rPr>
+        <w:t>烟酰胺有效改善暗沉，提亮整体肤色；腺苷深入肌底，帮助淡化面部细纹，提升肌肤紧致度。</w:t>
+      </w:r>
+    </w:p>
+    <w:p>
+      <w:pPr>
+        <w:spacing w:before="40" w:after="80" w:line="300" w:lineRule="auto"/>
+      </w:pPr>
+      <w:r>
+        <w:rPr>
+          <w:rFonts w:ascii="Malgun Gothic" w:hAnsi="Malgun Gothic"/>
+          <w:color w:val="374151"/>
+          <w:sz w:val="20"/>
+        </w:rPr>
+        <w:t>搭配PHA温和成分，令肌肤重现平滑透亮。</w:t>
       </w:r>
     </w:p>
     <w:p>
@@ -166,7 +205,20 @@
           <w:color w:val="212529"/>
           <w:sz w:val="21"/>
         </w:rPr>
-        <w:t>1) 本品获得韩国双重机能性审查。烟酰胺成分有效改善肌肤暗沉，提亮整体肤色。</w:t>
+        <w:t>Q2. 【护肤步骤与正确手法】：含有高浓度活性成分的BioFit焕亮复合精华面膜早晚使用顺序与涂抹手法？</w:t>
+      </w:r>
+    </w:p>
+    <w:p>
+      <w:pPr>
+        <w:spacing w:before="40" w:after="80" w:line="300" w:lineRule="auto"/>
+      </w:pPr>
+      <w:r>
+        <w:rPr>
+          <w:rFonts w:ascii="Malgun Gothic" w:hAnsi="Malgun Gothic"/>
+          <w:color w:val="374151"/>
+          <w:sz w:val="20"/>
+        </w:rPr>
+        <w:t>建议每周使用2至3次，夜间使用效果更佳。</w:t>
       </w:r>
     </w:p>
     <w:p>
@@ -180,7 +232,7 @@
           <w:color w:val="212529"/>
           <w:sz w:val="21"/>
         </w:rPr>
-        <w:t>2) 腺苷成分深入肌底，帮助淡化面部及眼周细纹，提升肌肤紧致度与弹性。</w:t>
+        <w:t>1) 洁面后，先用化妆水整理肌肤纹理。</w:t>
       </w:r>
     </w:p>
     <w:p>
@@ -194,7 +246,7 @@
           <w:color w:val="212529"/>
           <w:sz w:val="21"/>
         </w:rPr>
-        <w:t>3) PHA（葡萄糖酸内酯）温和代谢老废角质，打造平滑、透亮的水光肌理。</w:t>
+        <w:t>2) 取出面膜，去除前后保护膜，避开眼唇周围，将面膜平整贴合于全脸。</w:t>
       </w:r>
     </w:p>
     <w:p>
@@ -208,7 +260,7 @@
           <w:color w:val="212529"/>
           <w:sz w:val="21"/>
         </w:rPr>
-        <w:t>Q2. 【护肤步骤与正确手法】：含有高浓度活性成分的BioFit PHA复合焕亮面膜早晚使用顺序与涂抹手法？</w:t>
+        <w:t>3) 静享10至20分钟的放松时间后取下面膜。</w:t>
       </w:r>
     </w:p>
     <w:p>
@@ -222,49 +274,7 @@
           <w:color w:val="212529"/>
           <w:sz w:val="21"/>
         </w:rPr>
-        <w:t>1) 洁面后，首先使用化妆水整理肌肤纹理。</w:t>
-      </w:r>
-    </w:p>
-    <w:p>
-      <w:pPr>
-        <w:spacing w:before="160" w:after="60"/>
-      </w:pPr>
-      <w:r>
-        <w:rPr>
-          <w:rFonts w:ascii="Malgun Gothic" w:hAnsi="Malgun Gothic"/>
-          <w:b/>
-          <w:color w:val="212529"/>
-          <w:sz w:val="21"/>
-        </w:rPr>
-        <w:t>2) 取出面膜，撕去正反面的保护膜，避开眼部与唇部周围，将面膜均匀贴合于整个面部。</w:t>
-      </w:r>
-    </w:p>
-    <w:p>
-      <w:pPr>
-        <w:spacing w:before="160" w:after="60"/>
-      </w:pPr>
-      <w:r>
-        <w:rPr>
-          <w:rFonts w:ascii="Malgun Gothic" w:hAnsi="Malgun Gothic"/>
-          <w:b/>
-          <w:color w:val="212529"/>
-          <w:sz w:val="21"/>
-        </w:rPr>
-        <w:t>3) 享受10至20分钟的放松休息后，轻轻取下面膜。</w:t>
-      </w:r>
-    </w:p>
-    <w:p>
-      <w:pPr>
-        <w:spacing w:before="160" w:after="60"/>
-      </w:pPr>
-      <w:r>
-        <w:rPr>
-          <w:rFonts w:ascii="Malgun Gothic" w:hAnsi="Malgun Gothic"/>
-          <w:b/>
-          <w:color w:val="212529"/>
-          <w:sz w:val="21"/>
-        </w:rPr>
-        <w:t>4) 用指腹轻轻拍打面部剩余的精华液，直至完全吸收，后续无需水洗，可直接涂抹面霜锁水。</w:t>
+        <w:t>4) 用指腹轻拍面部剩余精华，直至完全吸收，后续可叠加乳液或面霜锁水。</w:t>
       </w:r>
     </w:p>
     <w:p>
@@ -283,16 +293,41 @@
     </w:p>
     <w:p>
       <w:pPr>
-        <w:spacing w:before="160" w:after="60"/>
+        <w:spacing w:before="40" w:after="80" w:line="300" w:lineRule="auto"/>
       </w:pPr>
       <w:r>
         <w:rPr>
           <w:rFonts w:ascii="Malgun Gothic" w:hAnsi="Malgun Gothic"/>
-          <w:b/>
-          <w:color w:val="212529"/>
-          <w:sz w:val="21"/>
+          <w:color w:val="374151"/>
+          <w:sz w:val="20"/>
         </w:rPr>
-        <w:t>1) 本产品配方经过科学调配，官方建议适用于所有肤质。</w:t>
+        <w:t>本产品经过科学配方调配，官方标明适用于所有肤质。</w:t>
+      </w:r>
+    </w:p>
+    <w:p>
+      <w:pPr>
+        <w:spacing w:before="40" w:after="80" w:line="300" w:lineRule="auto"/>
+      </w:pPr>
+      <w:r>
+        <w:rPr>
+          <w:rFonts w:ascii="Malgun Gothic" w:hAnsi="Malgun Gothic"/>
+          <w:color w:val="374151"/>
+          <w:sz w:val="20"/>
+        </w:rPr>
+        <w:t>内含泛醇、尿囊素及多种植物提取物（如芦荟叶、白柳树皮提取物），能在焕亮紧致的同时提供良好的舒缓保湿作用。</w:t>
+      </w:r>
+    </w:p>
+    <w:p>
+      <w:pPr>
+        <w:spacing w:before="40" w:after="80" w:line="300" w:lineRule="auto"/>
+      </w:pPr>
+      <w:r>
+        <w:rPr>
+          <w:rFonts w:ascii="Malgun Gothic" w:hAnsi="Malgun Gothic"/>
+          <w:color w:val="374151"/>
+          <w:sz w:val="20"/>
+        </w:rPr>
+        <w:t>若肌肤处于破损或极度敏感期，建议遵医嘱或暂停使用。</w:t>
       </w:r>
     </w:p>
     <w:p>
@@ -306,77 +341,20 @@
           <w:color w:val="212529"/>
           <w:sz w:val="21"/>
         </w:rPr>
-        <w:t>2) 核心成分PHA相较于传统果酸分子量更大，渗透更温和，配合泛醇（维生素B5）与芦荟叶提取物，在焕肤的同时能有效舒缓修护肌肤屏障。</w:t>
+        <w:t>Q4. 【成分协同与紧致机理】：核心复合成分如何协同解决肌肤暗沉与粗糙老化问题？</w:t>
       </w:r>
     </w:p>
     <w:p>
       <w:pPr>
-        <w:spacing w:before="160" w:after="60"/>
+        <w:spacing w:before="40" w:after="80" w:line="300" w:lineRule="auto"/>
       </w:pPr>
       <w:r>
         <w:rPr>
           <w:rFonts w:ascii="Malgun Gothic" w:hAnsi="Malgun Gothic"/>
-          <w:b/>
-          <w:color w:val="212529"/>
-          <w:sz w:val="21"/>
+          <w:color w:val="374151"/>
+          <w:sz w:val="20"/>
         </w:rPr>
-        <w:t>3) 若肌肤处于极度敏感、有红肿或破损伤口状态，请暂时避免使用；使用中如有不适，请咨询专业医师。</w:t>
-      </w:r>
-    </w:p>
-    <w:p>
-      <w:pPr>
-        <w:spacing w:before="160" w:after="60"/>
-      </w:pPr>
-      <w:r>
-        <w:rPr>
-          <w:rFonts w:ascii="Malgun Gothic" w:hAnsi="Malgun Gothic"/>
-          <w:b/>
-          <w:color w:val="212529"/>
-          <w:sz w:val="21"/>
-        </w:rPr>
-        <w:t>Q4. 【成分协同与紧致机理】：PHA复合成分如何协同解决眼周细纹与眼窝凹陷？</w:t>
-      </w:r>
-    </w:p>
-    <w:p>
-      <w:pPr>
-        <w:spacing w:before="160" w:after="60"/>
-      </w:pPr>
-      <w:r>
-        <w:rPr>
-          <w:rFonts w:ascii="Malgun Gothic" w:hAnsi="Malgun Gothic"/>
-          <w:b/>
-          <w:color w:val="212529"/>
-          <w:sz w:val="21"/>
-        </w:rPr>
-        <w:t>1) 腺苷作为核心抗皱成分，能有效焕活肌肤，针对眼角细纹及面部干纹发挥紧致淡化作用。</w:t>
-      </w:r>
-    </w:p>
-    <w:p>
-      <w:pPr>
-        <w:spacing w:before="160" w:after="60"/>
-      </w:pPr>
-      <w:r>
-        <w:rPr>
-          <w:rFonts w:ascii="Malgun Gothic" w:hAnsi="Malgun Gothic"/>
-          <w:b/>
-          <w:color w:val="212529"/>
-          <w:sz w:val="21"/>
-        </w:rPr>
-        <w:t>2) 透明质酸钠与PHA协同，为容易干瘪凹陷的肌肤区域（如眼周、面颊）注入并锁住海量水分，使肌肤恢复饱满弹润的视觉效果。</w:t>
-      </w:r>
-    </w:p>
-    <w:p>
-      <w:pPr>
-        <w:spacing w:before="160" w:after="60"/>
-      </w:pPr>
-      <w:r>
-        <w:rPr>
-          <w:rFonts w:ascii="Malgun Gothic" w:hAnsi="Malgun Gothic"/>
-          <w:b/>
-          <w:color w:val="212529"/>
-          <w:sz w:val="21"/>
-        </w:rPr>
-        <w:t>3) 烟酰胺同步提亮眼周暗沉，整体改善面部疲态，令肌肤焕发年轻光泽。</w:t>
+        <w:t>PHA（葡萄糖酸内酯）作为温和的成分，能轻柔代谢表层老废角质，打开肌肤吸收通道；此时烟酰胺与腺苷等高活性成分能更高效地渗透，实现外层平滑透亮、内层紧致淡纹的协同护肤效果，全面提升肌肤质感。</w:t>
       </w:r>
     </w:p>
     <w:p>
@@ -395,44 +373,28 @@
     </w:p>
     <w:p>
       <w:pPr>
-        <w:spacing w:before="160" w:after="60"/>
+        <w:spacing w:before="40" w:after="80" w:line="300" w:lineRule="auto"/>
       </w:pPr>
       <w:r>
         <w:rPr>
           <w:rFonts w:ascii="Malgun Gothic" w:hAnsi="Malgun Gothic"/>
-          <w:b/>
-          <w:color w:val="212529"/>
-          <w:sz w:val="21"/>
+          <w:color w:val="374151"/>
+          <w:sz w:val="20"/>
         </w:rPr>
-        <w:t>1) 日常存放请将产品放置于儿童无法触及的安全阴凉处。</w:t>
+        <w:t>日常请将产品存放于儿童无法触及的阴凉干燥处，严格避免阳光直射以保持活性成分的稳定。</w:t>
       </w:r>
     </w:p>
     <w:p>
       <w:pPr>
-        <w:spacing w:before="160" w:after="60"/>
+        <w:spacing w:before="40" w:after="80" w:line="300" w:lineRule="auto"/>
       </w:pPr>
       <w:r>
         <w:rPr>
           <w:rFonts w:ascii="Malgun Gothic" w:hAnsi="Malgun Gothic"/>
-          <w:b/>
-          <w:color w:val="212529"/>
-          <w:sz w:val="21"/>
+          <w:color w:val="374151"/>
+          <w:sz w:val="20"/>
         </w:rPr>
-        <w:t>2) 务必避开阳光直射，建议常温保存；夏季可冷藏后使用，以增加冰凉舒缓效果。</w:t>
-      </w:r>
-    </w:p>
-    <w:p>
-      <w:pPr>
-        <w:spacing w:before="160" w:after="60"/>
-      </w:pPr>
-      <w:r>
-        <w:rPr>
-          <w:rFonts w:ascii="Malgun Gothic" w:hAnsi="Malgun Gothic"/>
-          <w:b/>
-          <w:color w:val="212529"/>
-          <w:sz w:val="21"/>
-        </w:rPr>
-        <w:t>3) 如有任何产品疑问或售后需求，欢迎拨打官方消费者咨询热线：02-6743-3206，我们将为您提供专业的解答服务。</w:t>
+        <w:t>如在使用过程中有任何疑问或需要专业护肤指导，欢迎拨打官方消费者咨询热线：+82-2-6743-3206，我们将竭诚为您服务。</w:t>
       </w:r>
     </w:p>
     <w:sectPr>

</xml_diff>